<commit_message>
docs: rà soát 897 chính thức hồ sơ trình ban hành (0 Mức 1; sửa 3 Mức 2, 7 Mức 3), TB v9, HD v9 hoàn thiện, gói AI lần 6 cho 5 hệ (36 nguồn)
Co-Authored-By: Claude Opus 5.5 <noreply@anthropic.com>
</commit_message>
<xml_diff>
--- a/30-Ket-Qua/2026-10-10/Soan-Thao/BC_Khac-phuc-noi-dung-con-ton-tai-KTC-Quan-tri_trinh-tham-dinh-lan-2_20261010_v1.docx
+++ b/30-Ket-Qua/2026-10-10/Soan-Thao/BC_Khac-phuc-noi-dung-con-ton-tai-KTC-Quan-tri_trinh-tham-dinh-lan-2_20261010_v1.docx
@@ -791,9 +791,9 @@
                 <w:szCs w:val="26"/>
                 <w:b w:val="0"/>
               </w:rPr>
-              <w:t xml:space="preserve">Đã lập hồ sơ lấy ý kiến thẩm định độc lập lần 6 trên bản 1.3.13 (34 tài liệu, tệp plugin kèm mã kiểm tra toàn vẹn SHA</w:t>
+              <w:t xml:space="preserve">Đã lập hồ sơ lấy ý kiến thẩm định độc lập lần 6 trên bản 1.3.13 (36 tài liệu, tệp plugin kèm mã kiểm tra toàn vẹn SHA</w:t>
               <w:noBreakHyphen/>
-              <w:t xml:space="preserve">256) để gửi các hệ thống NotebookLM, Copilot, ChatGPT Work theo chỉ đạo của Hiệu trưởng.</w:t>
+              <w:t xml:space="preserve">256) để gửi các hệ thống NotebookLM, Copilot, ChatGPT Work theo chỉ đạo của Hiệu trưởng và Grok, Gemini.</w:t>
             </w:r>
           </w:p>
           <w:p>
@@ -1092,7 +1092,11 @@
               </w:rPr>
               <w:t xml:space="preserve">Kiểm tra cấu hình chia sẻ thư mục kho KTC</w:t>
               <w:noBreakHyphen/>
-              <w:t xml:space="preserve">Database trên Google Drive ngày 10/10/2026: Có 36 tài khoản, gồm 01 tài khoản chủ sở hữu (tài khoản của Trường), 03 tài khoản quản lý kho có quyền chỉnh sửa, 32 tài khoản của các đơn vị, cá nhân chỉ có quyền xem. Kho do phòng TH</w:t>
+              <w:t xml:space="preserve">Database trên Google Drive ngày 10/10/2026: Có 36 tài khoản, gồm 02 tài khoản quản lý kho (tài khoản của Trường là chủ sở hữu, tài khoản của phòng TH</w:t>
+              <w:noBreakHyphen/>
+              <w:t xml:space="preserve">HC&amp;QT có quyền chỉnh sửa), 32 tài khoản của các đơn vị, cá nhân chỉ có quyền xem; 02 tài khoản khác còn quyền chỉnh sửa được phòng TH</w:t>
+              <w:noBreakHyphen/>
+              <w:t xml:space="preserve">HC&amp;QT chuyển về quyền xem trước khi ban hành. Kho do phòng TH</w:t>
               <w:noBreakHyphen/>
               <w:t xml:space="preserve">HC&amp;QT trực tiếp quản lý, phân quyền nên không lập biên bản riêng.</w:t>
             </w:r>
@@ -1366,9 +1370,9 @@
               </w:rPr>
               <w:t xml:space="preserve">Phòng TCCB&amp;CTHSSV đã có ý kiến ngày 06/10/2026 tại Phiếu xin ý kiến của phòng TH</w:t>
               <w:noBreakHyphen/>
-              <w:t xml:space="preserve">HC&amp;QT: Khối lượng KPI cá nhân quy đổi chỉ theo hệ số sản phẩm tại Danh mục ban hành kèm theo Quyết định số 2119/QĐ</w:t>
+              <w:t xml:space="preserve">HC&amp;QT: Từ Quý IV/2026, khối lượng KPI cá nhân quy đổi chỉ theo hệ số sản phẩm tại Danh mục ban hành kèm theo Quyết định số 2119/QĐ</w:t>
               <w:noBreakHyphen/>
-              <w:t xml:space="preserve">CĐKT ngày 28/9/2026 của Hiệu trưởng Trường Cao đẳng Kon Tum ban hành Danh mục sản phẩm, công việc, áp dụng từ Quý IV/2026, không nhân với hệ số mức độ công việc; mẫu Phụ lục I, Phụ lục II kèm theo Quyết định số 1923/QĐ</w:t>
+              <w:t xml:space="preserve">CĐKT ngày 28/9/2026 của Hiệu trưởng Trường Cao đẳng Kon Tum ban hành Danh mục sản phẩm, công việc, không nhân với hệ số mức độ công việc; mẫu Phụ lục I, Phụ lục II kèm theo Quyết định số 1923/QĐ</w:t>
               <w:noBreakHyphen/>
               <w:t xml:space="preserve">CĐKT ngày 30/8/2026 của Hiệu trưởng Trường Cao đẳng Kon Tum ban hành Quy chế đánh giá, xếp loại chất lượng tập thể, cá nhân gắn với Chỉ số đánh giá hiệu quả công việc (KPI) giữ nguyên thang 04 mức độ công việc.</w:t>
             </w:r>

</xml_diff>